<commit_message>
Update Customer Tone Annotation Guidelines.md: Refined instructions for labeling customer tones, emphasizing the importance of considering all messages in a conversation and clarifying the order of precedence for tone classification. Adjusted examples to better illustrate the labeling process.
</commit_message>
<xml_diff>
--- a/docs/Phase 1.docx
+++ b/docs/Phase 1.docx
@@ -21,6 +21,8 @@
     </w:p>
     <w:p>
       <w:pPr>
+        <w:widowControl/>
+        <w:spacing w:after="100" w:line="259" w:lineRule="auto"/>
         <w:rPr>
           <w:rFonts w:asciiTheme="majorHAnsi" w:hAnsiTheme="majorHAnsi" w:cstheme="majorHAnsi"/>
           <w:color w:val="000000" w:themeColor="text1"/>
@@ -31,35 +33,7 @@
           <w:rFonts w:asciiTheme="majorHAnsi" w:hAnsiTheme="majorHAnsi" w:cstheme="majorHAnsi"/>
           <w:color w:val="000000" w:themeColor="text1"/>
         </w:rPr>
-        <w:t xml:space="preserve">Team members: </w:t>
-      </w:r>
-      <w:r>
-        <w:rPr>
-          <w:rFonts w:asciiTheme="majorHAnsi" w:hAnsiTheme="majorHAnsi" w:cstheme="majorHAnsi"/>
-          <w:color w:val="000000" w:themeColor="text1"/>
-        </w:rPr>
-        <w:t>Venkat</w:t>
-      </w:r>
-      <w:r>
-        <w:rPr>
-          <w:rFonts w:asciiTheme="majorHAnsi" w:hAnsiTheme="majorHAnsi" w:cstheme="majorHAnsi"/>
-          <w:color w:val="000000" w:themeColor="text1"/>
-        </w:rPr>
-        <w:t xml:space="preserve">, </w:t>
-      </w:r>
-      <w:r>
-        <w:rPr>
-          <w:rFonts w:asciiTheme="majorHAnsi" w:hAnsiTheme="majorHAnsi" w:cstheme="majorHAnsi"/>
-          <w:color w:val="000000" w:themeColor="text1"/>
-        </w:rPr>
-        <w:t>Vishnu</w:t>
-      </w:r>
-      <w:r>
-        <w:rPr>
-          <w:rFonts w:asciiTheme="majorHAnsi" w:hAnsiTheme="majorHAnsi" w:cstheme="majorHAnsi"/>
-          <w:color w:val="000000" w:themeColor="text1"/>
-        </w:rPr>
-        <w:t>, and Roshkrishna</w:t>
+        <w:t>Team members: Venkat, Vishnu, and Roshkrishna</w:t>
       </w:r>
     </w:p>
     <w:p>
@@ -80,7 +54,8 @@
     </w:p>
     <w:p>
       <w:pPr>
-        <w:spacing w:after="120" w:line="276" w:lineRule="auto"/>
+        <w:widowControl/>
+        <w:spacing w:after="100" w:line="259" w:lineRule="auto"/>
         <w:rPr>
           <w:rFonts w:asciiTheme="majorHAnsi" w:hAnsiTheme="majorHAnsi" w:cstheme="majorHAnsi"/>
           <w:color w:val="000000" w:themeColor="text1"/>
@@ -91,12 +66,14 @@
           <w:rFonts w:asciiTheme="majorHAnsi" w:hAnsiTheme="majorHAnsi" w:cstheme="majorHAnsi"/>
           <w:color w:val="000000" w:themeColor="text1"/>
         </w:rPr>
-        <w:t>Our task is to classify the tone of customer-service messages into five categories: appreciative or positive, neutral or informational, help-seeking or asking a question, frustrated or complaining, and escalatory or requesting immediate resolution.</w:t>
+        <w:t>Our task is to classify the customer's overall tone across a complete customer-support conversation into five categories: appreciative or positive, neutral or informational, help-seeking or asking a question, frustrated or complaining, and escalatory or requesting immediate resolution. Customer messages provide the evidence; agent replies provide context.</w:t>
       </w:r>
     </w:p>
     <w:p>
       <w:pPr>
-        <w:spacing w:after="120" w:line="276" w:lineRule="auto"/>
+        <w:keepNext/>
+        <w:widowControl/>
+        <w:spacing w:after="100" w:line="259" w:lineRule="auto"/>
         <w:rPr>
           <w:rFonts w:asciiTheme="majorHAnsi" w:hAnsiTheme="majorHAnsi" w:cstheme="majorHAnsi"/>
           <w:b/>
@@ -116,7 +93,9 @@
     </w:p>
     <w:p>
       <w:pPr>
-        <w:spacing w:after="120" w:line="276" w:lineRule="auto"/>
+        <w:keepNext/>
+        <w:widowControl/>
+        <w:spacing w:after="100" w:line="259" w:lineRule="auto"/>
         <w:rPr>
           <w:rFonts w:asciiTheme="majorHAnsi" w:hAnsiTheme="majorHAnsi" w:cstheme="majorHAnsi"/>
           <w:color w:val="000000" w:themeColor="text1"/>
@@ -127,12 +106,13 @@
           <w:rFonts w:asciiTheme="majorHAnsi" w:hAnsiTheme="majorHAnsi" w:cstheme="majorHAnsi"/>
           <w:color w:val="000000" w:themeColor="text1"/>
         </w:rPr>
-        <w:t>Previous conversation:</w:t>
+        <w:t>Conversation (a real AmazonHelp conversation from our dataset):</w:t>
       </w:r>
     </w:p>
     <w:p>
       <w:pPr>
-        <w:spacing w:after="120" w:line="276" w:lineRule="auto"/>
+        <w:widowControl/>
+        <w:spacing w:after="60" w:line="259" w:lineRule="auto"/>
         <w:rPr>
           <w:rFonts w:asciiTheme="majorHAnsi" w:hAnsiTheme="majorHAnsi" w:cstheme="majorHAnsi"/>
           <w:color w:val="000000" w:themeColor="text1"/>
@@ -143,12 +123,13 @@
           <w:rFonts w:asciiTheme="majorHAnsi" w:hAnsiTheme="majorHAnsi" w:cstheme="majorHAnsi"/>
           <w:color w:val="000000" w:themeColor="text1"/>
         </w:rPr>
-        <w:t>Support: Your refund request has been submitted.</w:t>
+        <w:t>Customer: Your email support for amazon Flex is horrible. I need help to get the money I worked for!!!! PLEASE HELP ME !</w:t>
       </w:r>
     </w:p>
     <w:p>
       <w:pPr>
-        <w:spacing w:after="120" w:line="276" w:lineRule="auto"/>
+        <w:widowControl/>
+        <w:spacing w:after="60" w:line="259" w:lineRule="auto"/>
         <w:rPr>
           <w:rFonts w:asciiTheme="majorHAnsi" w:hAnsiTheme="majorHAnsi" w:cstheme="majorHAnsi"/>
           <w:color w:val="000000" w:themeColor="text1"/>
@@ -159,12 +140,13 @@
           <w:rFonts w:asciiTheme="majorHAnsi" w:hAnsiTheme="majorHAnsi" w:cstheme="majorHAnsi"/>
           <w:color w:val="000000" w:themeColor="text1"/>
         </w:rPr>
-        <w:t>Current customer message:</w:t>
+        <w:t>Support: Please submit any payment questions via the Flex mobile app. Here's some FAQs that might help: [link]</w:t>
       </w:r>
     </w:p>
     <w:p>
       <w:pPr>
-        <w:spacing w:after="120" w:line="276" w:lineRule="auto"/>
+        <w:widowControl/>
+        <w:spacing w:after="60" w:line="259" w:lineRule="auto"/>
         <w:rPr>
           <w:rFonts w:asciiTheme="majorHAnsi" w:hAnsiTheme="majorHAnsi" w:cstheme="majorHAnsi"/>
           <w:color w:val="000000" w:themeColor="text1"/>
@@ -175,12 +157,83 @@
           <w:rFonts w:asciiTheme="majorHAnsi" w:hAnsiTheme="majorHAnsi" w:cstheme="majorHAnsi"/>
           <w:color w:val="000000" w:themeColor="text1"/>
         </w:rPr>
-        <w:t>I have been waiting two weeks for my refund. Please fix this immediately.</w:t>
+        <w:t>Customer: Again with the generic responses. I submitted via the app but i am only getting prewritten respones back. I need a human to help me !!!</w:t>
       </w:r>
     </w:p>
     <w:p>
       <w:pPr>
-        <w:spacing w:after="120" w:line="276" w:lineRule="auto"/>
+        <w:widowControl/>
+        <w:spacing w:after="60" w:line="259" w:lineRule="auto"/>
+        <w:rPr>
+          <w:rFonts w:asciiTheme="majorHAnsi" w:hAnsiTheme="majorHAnsi" w:cstheme="majorHAnsi"/>
+          <w:color w:val="000000" w:themeColor="text1"/>
+        </w:rPr>
+      </w:pPr>
+      <w:r>
+        <w:rPr>
+          <w:rFonts w:asciiTheme="majorHAnsi" w:hAnsiTheme="majorHAnsi" w:cstheme="majorHAnsi"/>
+          <w:color w:val="000000" w:themeColor="text1"/>
+        </w:rPr>
+        <w:t>Support: We'd like to look into this for you. Please send us your details here: [link]</w:t>
+      </w:r>
+    </w:p>
+    <w:p>
+      <w:pPr>
+        <w:widowControl/>
+        <w:spacing w:after="60" w:line="259" w:lineRule="auto"/>
+        <w:rPr>
+          <w:rFonts w:asciiTheme="majorHAnsi" w:hAnsiTheme="majorHAnsi" w:cstheme="majorHAnsi"/>
+          <w:color w:val="000000" w:themeColor="text1"/>
+        </w:rPr>
+      </w:pPr>
+      <w:r>
+        <w:rPr>
+          <w:rFonts w:asciiTheme="majorHAnsi" w:hAnsiTheme="majorHAnsi" w:cstheme="majorHAnsi"/>
+          <w:color w:val="000000" w:themeColor="text1"/>
+        </w:rPr>
+        <w:t>Customer: Can you have a manger Call me ? This is ridiculous. You guys owe me money that I worked for. Do I have to file a lawsuit?</w:t>
+      </w:r>
+    </w:p>
+    <w:p>
+      <w:pPr>
+        <w:keepNext/>
+        <w:widowControl/>
+        <w:spacing w:after="100" w:line="259" w:lineRule="auto"/>
+        <w:rPr>
+          <w:rFonts w:asciiTheme="majorHAnsi" w:hAnsiTheme="majorHAnsi" w:cstheme="majorHAnsi"/>
+          <w:color w:val="000000" w:themeColor="text1"/>
+        </w:rPr>
+      </w:pPr>
+      <w:r>
+        <w:rPr>
+          <w:rFonts w:asciiTheme="majorHAnsi" w:hAnsiTheme="majorHAnsi" w:cstheme="majorHAnsi"/>
+          <w:color w:val="000000" w:themeColor="text1"/>
+        </w:rPr>
+        <w:t>Last customer message (shown separately for comparison with the full conversation):</w:t>
+      </w:r>
+    </w:p>
+    <w:p>
+      <w:pPr>
+        <w:widowControl/>
+        <w:spacing w:after="100" w:line="259" w:lineRule="auto"/>
+        <w:rPr>
+          <w:rFonts w:asciiTheme="majorHAnsi" w:hAnsiTheme="majorHAnsi" w:cstheme="majorHAnsi"/>
+          <w:color w:val="000000" w:themeColor="text1"/>
+        </w:rPr>
+      </w:pPr>
+      <w:r>
+        <w:rPr>
+          <w:rFonts w:asciiTheme="majorHAnsi" w:hAnsiTheme="majorHAnsi" w:cstheme="majorHAnsi"/>
+          <w:color w:val="000000" w:themeColor="text1"/>
+        </w:rPr>
+        <w:t>Can you have a manger Call me ? This is ridiculous. You guys owe me money that I worked for. Do I have to file a lawsuit?</w:t>
+      </w:r>
+    </w:p>
+    <w:p>
+      <w:pPr>
+        <w:keepNext/>
+        <w:widowControl/>
+        <w:spacing w:after="100" w:line="259" w:lineRule="auto"/>
         <w:rPr>
           <w:rFonts w:asciiTheme="majorHAnsi" w:hAnsiTheme="majorHAnsi" w:cstheme="majorHAnsi"/>
           <w:color w:val="000000" w:themeColor="text1"/>
@@ -196,7 +249,8 @@
     </w:p>
     <w:p>
       <w:pPr>
-        <w:spacing w:after="120" w:line="276" w:lineRule="auto"/>
+        <w:widowControl/>
+        <w:spacing w:after="100" w:line="259" w:lineRule="auto"/>
         <w:rPr>
           <w:rFonts w:asciiTheme="majorHAnsi" w:hAnsiTheme="majorHAnsi" w:cstheme="majorHAnsi"/>
           <w:color w:val="000000" w:themeColor="text1"/>
@@ -212,6 +266,23 @@
     </w:p>
     <w:p>
       <w:pPr>
+        <w:widowControl/>
+        <w:spacing w:after="100" w:line="259" w:lineRule="auto"/>
+        <w:rPr>
+          <w:rFonts w:asciiTheme="majorHAnsi" w:hAnsiTheme="majorHAnsi" w:cstheme="majorHAnsi"/>
+          <w:color w:val="000000" w:themeColor="text1"/>
+        </w:rPr>
+      </w:pPr>
+      <w:r>
+        <w:rPr>
+          <w:rFonts w:asciiTheme="majorHAnsi" w:hAnsiTheme="majorHAnsi" w:cstheme="majorHAnsi"/>
+          <w:color w:val="000000" w:themeColor="text1"/>
+        </w:rPr>
+        <w:t>Why: across the exchange, the customer complains about generic replies, asks for a human, requests a manager, and mentions a lawsuit. These demands and threats support the Escalatory label. The final message shows escalation, while the history explains how it developed.</w:t>
+      </w:r>
+    </w:p>
+    <w:p>
+      <w:pPr>
         <w:pStyle w:val="Heading1"/>
         <w:rPr>
           <w:rFonts w:cstheme="majorHAnsi"/>
@@ -228,7 +299,8 @@
     </w:p>
     <w:p>
       <w:pPr>
-        <w:spacing w:after="120"/>
+        <w:widowControl/>
+        <w:spacing w:after="100" w:line="259" w:lineRule="auto"/>
         <w:rPr>
           <w:rFonts w:asciiTheme="majorHAnsi" w:hAnsiTheme="majorHAnsi" w:cstheme="majorHAnsi"/>
           <w:color w:val="000000" w:themeColor="text1"/>
@@ -239,12 +311,14 @@
           <w:rFonts w:asciiTheme="majorHAnsi" w:hAnsiTheme="majorHAnsi" w:cstheme="majorHAnsi"/>
           <w:color w:val="000000" w:themeColor="text1"/>
         </w:rPr>
-        <w:t>Customer-service teams receive thousands of messages a day, and a customer's tone shows how the conversation is going. Classifying tone is useful for several reasons:</w:t>
+        <w:t>Customer-support conversations contain both requests and reactions to the help provided. Tone adds information about those reactions. Combined with the request and conversation history, it could support the following uses:</w:t>
       </w:r>
     </w:p>
     <w:p>
       <w:pPr>
         <w:pStyle w:val="ListBullet"/>
+        <w:widowControl/>
+        <w:spacing w:after="40" w:line="259" w:lineRule="auto"/>
         <w:rPr>
           <w:rFonts w:asciiTheme="majorHAnsi" w:hAnsiTheme="majorHAnsi" w:cstheme="majorHAnsi"/>
           <w:color w:val="000000" w:themeColor="text1"/>
@@ -256,19 +330,21 @@
           <w:b/>
           <w:color w:val="000000" w:themeColor="text1"/>
         </w:rPr>
-        <w:t>Spotting urgency early.</w:t>
+        <w:t>Identifying conversations needing attention.</w:t>
       </w:r>
       <w:r>
         <w:rPr>
           <w:rFonts w:asciiTheme="majorHAnsi" w:hAnsiTheme="majorHAnsi" w:cstheme="majorHAnsi"/>
           <w:color w:val="000000" w:themeColor="text1"/>
         </w:rPr>
-        <w:t xml:space="preserve"> Tone separates a calm question from an angry customer who needs an answer now. A tone classifier can push frustrated and escalatory messages to the front of the queue before the customer gives up or goes public.</w:t>
+        <w:t xml:space="preserve"> Recognizing frustration or escalation can help flag conversations for review. Tone adds a signal alongside the request and issue severity; anger alone does not establish urgency.</w:t>
       </w:r>
     </w:p>
     <w:p>
       <w:pPr>
         <w:pStyle w:val="ListBullet"/>
+        <w:widowControl/>
+        <w:spacing w:after="40" w:line="259" w:lineRule="auto"/>
         <w:rPr>
           <w:rFonts w:asciiTheme="majorHAnsi" w:hAnsiTheme="majorHAnsi" w:cstheme="majorHAnsi"/>
           <w:color w:val="000000" w:themeColor="text1"/>
@@ -280,19 +356,21 @@
           <w:b/>
           <w:color w:val="000000" w:themeColor="text1"/>
         </w:rPr>
-        <w:t>Measuring how messages are handled.</w:t>
+        <w:t>Finding conversations worth reviewing.</w:t>
       </w:r>
       <w:r>
         <w:rPr>
           <w:rFonts w:asciiTheme="majorHAnsi" w:hAnsiTheme="majorHAnsi" w:cstheme="majorHAnsi"/>
           <w:color w:val="000000" w:themeColor="text1"/>
         </w:rPr>
-        <w:t xml:space="preserve"> Tone over a conversation shows whether agent replies calm a customer down or make things worse. Managers can find conversations that end frustrated or escalate, see which reply styles work, and coach the support team using real examples.</w:t>
+        <w:t xml:space="preserve"> Managers can review conversations expressing frustration or escalation alongside the customer’s issue and the support provided. Tone alone does not establish whether the problem was resolved or support failed.</w:t>
       </w:r>
     </w:p>
     <w:p>
       <w:pPr>
         <w:pStyle w:val="ListBullet"/>
+        <w:widowControl/>
+        <w:spacing w:after="40" w:line="259" w:lineRule="auto"/>
         <w:rPr>
           <w:rFonts w:asciiTheme="majorHAnsi" w:hAnsiTheme="majorHAnsi" w:cstheme="majorHAnsi"/>
           <w:color w:val="000000" w:themeColor="text1"/>
@@ -304,19 +382,21 @@
           <w:b/>
           <w:color w:val="000000" w:themeColor="text1"/>
         </w:rPr>
-        <w:t>Retaining customers and protecting reputation.</w:t>
+        <w:t>Supporting customer follow-up.</w:t>
       </w:r>
       <w:r>
         <w:rPr>
           <w:rFonts w:asciiTheme="majorHAnsi" w:hAnsiTheme="majorHAnsi" w:cstheme="majorHAnsi"/>
           <w:color w:val="000000" w:themeColor="text1"/>
         </w:rPr>
-        <w:t xml:space="preserve"> In a very competitive market, keeping a customer is harder than winning a new one, and one bad support experience can send them to a competitor. Twitter support is public, so an unresolved angry customer is also visible to everyone else, and companies do not want to be known for poor or slow responses.</w:t>
+        <w:t xml:space="preserve"> Recognizing dissatisfaction could help teams offer more attentive follow-up. Any effect on customer retention or reputation would need separate evaluation.</w:t>
       </w:r>
     </w:p>
     <w:p>
       <w:pPr>
         <w:pStyle w:val="ListBullet"/>
+        <w:widowControl/>
+        <w:spacing w:after="40" w:line="259" w:lineRule="auto"/>
         <w:rPr>
           <w:rFonts w:asciiTheme="majorHAnsi" w:hAnsiTheme="majorHAnsi" w:cstheme="majorHAnsi"/>
           <w:color w:val="000000" w:themeColor="text1"/>
@@ -328,19 +408,21 @@
           <w:b/>
           <w:color w:val="000000" w:themeColor="text1"/>
         </w:rPr>
-        <w:t>Revealing system and process problems.</w:t>
+        <w:t>Flagging recurring dissatisfaction.</w:t>
       </w:r>
       <w:r>
         <w:rPr>
           <w:rFonts w:asciiTheme="majorHAnsi" w:hAnsiTheme="majorHAnsi" w:cstheme="majorHAnsi"/>
           <w:color w:val="000000" w:themeColor="text1"/>
         </w:rPr>
-        <w:t xml:space="preserve"> If many customers in a period sound frustrated or escalatory about the same thing, such as late deliveries or refunds, the cause is often a system or process fault (a broken tracking page, a delivery partner, a refund bug) rather than individual agents. Tone trends can act as an early warning that something needs fixing.</w:t>
+        <w:t xml:space="preserve"> Repeated frustration around the same issue can highlight patterns worth investigating. This requires identifying the issue as well as the tone; the tone label does not establish the cause.</w:t>
       </w:r>
     </w:p>
     <w:p>
       <w:pPr>
         <w:pStyle w:val="ListBullet"/>
+        <w:widowControl/>
+        <w:spacing w:after="40" w:line="259" w:lineRule="auto"/>
         <w:rPr>
           <w:rFonts w:asciiTheme="majorHAnsi" w:hAnsiTheme="majorHAnsi" w:cstheme="majorHAnsi"/>
           <w:color w:val="000000" w:themeColor="text1"/>
@@ -352,19 +434,21 @@
           <w:b/>
           <w:color w:val="000000" w:themeColor="text1"/>
         </w:rPr>
-        <w:t>Supporting better automation.</w:t>
+        <w:t>Supporting appropriate responses.</w:t>
       </w:r>
       <w:r>
         <w:rPr>
           <w:rFonts w:asciiTheme="majorHAnsi" w:hAnsiTheme="majorHAnsi" w:cstheme="majorHAnsi"/>
           <w:color w:val="000000" w:themeColor="text1"/>
         </w:rPr>
-        <w:t xml:space="preserve"> Chatbots and routing systems that ignore tone can answer an angry customer with a cheerful script. Tone labels help them decide when to hand a conversation to a human and how to word a reply.</w:t>
+        <w:t xml:space="preserve"> Tone can inform acknowledgment and help avoid inappropriate wording. Together with the request and history, it can also inform human handoff. The requested action and relevant facts determine the solution.</w:t>
       </w:r>
     </w:p>
     <w:p>
       <w:pPr>
         <w:pStyle w:val="ListBullet"/>
+        <w:widowControl/>
+        <w:spacing w:after="40" w:line="259" w:lineRule="auto"/>
         <w:rPr>
           <w:rFonts w:asciiTheme="majorHAnsi" w:hAnsiTheme="majorHAnsi" w:cstheme="majorHAnsi"/>
           <w:color w:val="000000" w:themeColor="text1"/>
@@ -376,18 +460,44 @@
           <w:b/>
           <w:color w:val="000000" w:themeColor="text1"/>
         </w:rPr>
-        <w:t>A task that needs judgment.</w:t>
+        <w:t>Studying conversation context.</w:t>
       </w:r>
       <w:r>
         <w:rPr>
           <w:rFonts w:asciiTheme="majorHAnsi" w:hAnsiTheme="majorHAnsi" w:cstheme="majorHAnsi"/>
           <w:color w:val="000000" w:themeColor="text1"/>
         </w:rPr>
-        <w:t xml:space="preserve"> Tone depends on context, for example sarcastic thanks after an unhelpful reply is a complaint, not appreciation. This makes it a good problem for human annotation and for studying how well models understand conversation, and the labeled data can be reused for research.</w:t>
+        <w:t xml:space="preserve"> A short message such as “Thanks a lot” may express appreciation or sarcasm. Reading the exchange helps interpret it. Conversation-level labels allow us to study whether models benefit from that context.</w:t>
       </w:r>
     </w:p>
     <w:p>
       <w:pPr>
+        <w:pStyle w:val="ListBullet"/>
+        <w:widowControl/>
+        <w:spacing w:after="40" w:line="259" w:lineRule="auto"/>
+        <w:rPr>
+          <w:rFonts w:asciiTheme="majorHAnsi" w:hAnsiTheme="majorHAnsi" w:cstheme="majorHAnsi"/>
+          <w:color w:val="000000" w:themeColor="text1"/>
+        </w:rPr>
+      </w:pPr>
+      <w:r>
+        <w:rPr>
+          <w:rFonts w:asciiTheme="majorHAnsi" w:hAnsiTheme="majorHAnsi" w:cstheme="majorHAnsi"/>
+          <w:b/>
+          <w:color w:val="000000" w:themeColor="text1"/>
+        </w:rPr>
+        <w:t>Creating a labeled resource.</w:t>
+      </w:r>
+      <w:r>
+        <w:rPr>
+          <w:rFonts w:asciiTheme="majorHAnsi" w:hAnsiTheme="majorHAnsi" w:cstheme="majorHAnsi"/>
+          <w:color w:val="000000" w:themeColor="text1"/>
+        </w:rPr>
+        <w:t xml:space="preserve"> Human annotation adds tone labels to the selected conversations. Shared items let us measure agreement and examine difficult distinctions, such as frustration versus escalation.</w:t>
+      </w:r>
+    </w:p>
+    <w:p>
+      <w:pPr>
         <w:pStyle w:val="Heading1"/>
         <w:rPr>
           <w:rFonts w:cstheme="majorHAnsi"/>
@@ -399,13 +509,13 @@
           <w:rFonts w:cstheme="majorHAnsi"/>
           <w:color w:val="000000" w:themeColor="text1"/>
         </w:rPr>
-        <w:lastRenderedPageBreak/>
         <w:t>3. Dataset Description</w:t>
       </w:r>
     </w:p>
     <w:p>
       <w:pPr>
-        <w:spacing w:after="120"/>
+        <w:widowControl/>
+        <w:spacing w:after="100" w:line="259" w:lineRule="auto"/>
         <w:rPr>
           <w:rFonts w:asciiTheme="majorHAnsi" w:hAnsiTheme="majorHAnsi" w:cstheme="majorHAnsi"/>
           <w:color w:val="000000" w:themeColor="text1"/>
@@ -421,7 +531,8 @@
     </w:p>
     <w:p>
       <w:pPr>
-        <w:spacing w:after="120"/>
+        <w:widowControl/>
+        <w:spacing w:after="100" w:line="259" w:lineRule="auto"/>
         <w:rPr>
           <w:rFonts w:asciiTheme="majorHAnsi" w:hAnsiTheme="majorHAnsi" w:cstheme="majorHAnsi"/>
           <w:color w:val="000000" w:themeColor="text1"/>
@@ -437,7 +548,8 @@
     </w:p>
     <w:p>
       <w:pPr>
-        <w:spacing w:after="120"/>
+        <w:widowControl/>
+        <w:spacing w:after="100" w:line="259" w:lineRule="auto"/>
         <w:rPr>
           <w:rFonts w:asciiTheme="majorHAnsi" w:hAnsiTheme="majorHAnsi" w:cstheme="majorHAnsi"/>
           <w:color w:val="000000" w:themeColor="text1"/>
@@ -462,6 +574,8 @@
     <w:p>
       <w:pPr>
         <w:pStyle w:val="ListBullet"/>
+        <w:widowControl/>
+        <w:spacing w:after="40" w:line="259" w:lineRule="auto"/>
         <w:rPr>
           <w:rFonts w:asciiTheme="majorHAnsi" w:hAnsiTheme="majorHAnsi" w:cstheme="majorHAnsi"/>
           <w:color w:val="000000" w:themeColor="text1"/>
@@ -486,6 +600,8 @@
     <w:p>
       <w:pPr>
         <w:pStyle w:val="ListBullet"/>
+        <w:widowControl/>
+        <w:spacing w:after="40" w:line="259" w:lineRule="auto"/>
         <w:rPr>
           <w:rFonts w:asciiTheme="majorHAnsi" w:hAnsiTheme="majorHAnsi" w:cstheme="majorHAnsi"/>
           <w:color w:val="000000" w:themeColor="text1"/>
@@ -510,6 +626,8 @@
     <w:p>
       <w:pPr>
         <w:pStyle w:val="ListBullet"/>
+        <w:widowControl/>
+        <w:spacing w:after="40" w:line="259" w:lineRule="auto"/>
         <w:rPr>
           <w:rFonts w:asciiTheme="majorHAnsi" w:hAnsiTheme="majorHAnsi" w:cstheme="majorHAnsi"/>
           <w:color w:val="000000" w:themeColor="text1"/>
@@ -534,6 +652,8 @@
     <w:p>
       <w:pPr>
         <w:pStyle w:val="ListBullet"/>
+        <w:widowControl/>
+        <w:spacing w:after="40" w:line="259" w:lineRule="auto"/>
         <w:rPr>
           <w:rFonts w:asciiTheme="majorHAnsi" w:hAnsiTheme="majorHAnsi" w:cstheme="majorHAnsi"/>
           <w:color w:val="000000" w:themeColor="text1"/>
@@ -558,6 +678,8 @@
     <w:p>
       <w:pPr>
         <w:pStyle w:val="ListBullet"/>
+        <w:widowControl/>
+        <w:spacing w:after="40" w:line="259" w:lineRule="auto"/>
         <w:rPr>
           <w:rFonts w:asciiTheme="majorHAnsi" w:hAnsiTheme="majorHAnsi" w:cstheme="majorHAnsi"/>
           <w:color w:val="000000" w:themeColor="text1"/>
@@ -582,6 +704,8 @@
     <w:p>
       <w:pPr>
         <w:pStyle w:val="ListBullet"/>
+        <w:widowControl/>
+        <w:spacing w:after="40" w:line="259" w:lineRule="auto"/>
         <w:rPr>
           <w:rFonts w:asciiTheme="majorHAnsi" w:hAnsiTheme="majorHAnsi" w:cstheme="majorHAnsi"/>
           <w:color w:val="000000" w:themeColor="text1"/>
@@ -606,6 +730,8 @@
     <w:p>
       <w:pPr>
         <w:pStyle w:val="ListBullet"/>
+        <w:widowControl/>
+        <w:spacing w:after="40" w:line="259" w:lineRule="auto"/>
         <w:rPr>
           <w:rFonts w:asciiTheme="majorHAnsi" w:hAnsiTheme="majorHAnsi" w:cstheme="majorHAnsi"/>
           <w:color w:val="000000" w:themeColor="text1"/>
@@ -629,7 +755,8 @@
     </w:p>
     <w:p>
       <w:pPr>
-        <w:spacing w:after="120"/>
+        <w:widowControl/>
+        <w:spacing w:after="100" w:line="259" w:lineRule="auto"/>
         <w:rPr>
           <w:rFonts w:asciiTheme="majorHAnsi" w:hAnsiTheme="majorHAnsi" w:cstheme="majorHAnsi"/>
           <w:color w:val="000000" w:themeColor="text1"/>
@@ -653,7 +780,8 @@
     </w:p>
     <w:p>
       <w:pPr>
-        <w:spacing w:after="120"/>
+        <w:widowControl/>
+        <w:spacing w:after="100" w:line="259" w:lineRule="auto"/>
         <w:rPr>
           <w:rFonts w:asciiTheme="majorHAnsi" w:hAnsiTheme="majorHAnsi" w:cstheme="majorHAnsi"/>
           <w:color w:val="000000" w:themeColor="text1"/>
@@ -678,6 +806,8 @@
     <w:p>
       <w:pPr>
         <w:pStyle w:val="ListBullet"/>
+        <w:widowControl/>
+        <w:spacing w:after="40" w:line="259" w:lineRule="auto"/>
         <w:rPr>
           <w:rFonts w:asciiTheme="majorHAnsi" w:hAnsiTheme="majorHAnsi" w:cstheme="majorHAnsi"/>
           <w:color w:val="000000" w:themeColor="text1"/>
@@ -702,6 +832,8 @@
     <w:p>
       <w:pPr>
         <w:pStyle w:val="ListBullet"/>
+        <w:widowControl/>
+        <w:spacing w:after="40" w:line="259" w:lineRule="auto"/>
         <w:rPr>
           <w:rFonts w:asciiTheme="majorHAnsi" w:hAnsiTheme="majorHAnsi" w:cstheme="majorHAnsi"/>
           <w:color w:val="000000" w:themeColor="text1"/>
@@ -726,6 +858,8 @@
     <w:p>
       <w:pPr>
         <w:pStyle w:val="ListBullet"/>
+        <w:widowControl/>
+        <w:spacing w:after="40" w:line="259" w:lineRule="auto"/>
         <w:rPr>
           <w:rFonts w:asciiTheme="majorHAnsi" w:hAnsiTheme="majorHAnsi" w:cstheme="majorHAnsi"/>
           <w:color w:val="000000" w:themeColor="text1"/>
@@ -737,6 +871,7 @@
           <w:b/>
           <w:color w:val="000000" w:themeColor="text1"/>
         </w:rPr>
+        <w:lastRenderedPageBreak/>
         <w:t>Translate and filter languages</w:t>
       </w:r>
       <w:r>
@@ -750,6 +885,8 @@
     <w:p>
       <w:pPr>
         <w:pStyle w:val="ListBullet"/>
+        <w:widowControl/>
+        <w:spacing w:after="40" w:line="259" w:lineRule="auto"/>
         <w:rPr>
           <w:rFonts w:asciiTheme="majorHAnsi" w:hAnsiTheme="majorHAnsi" w:cstheme="majorHAnsi"/>
           <w:color w:val="000000" w:themeColor="text1"/>
@@ -774,6 +911,8 @@
     <w:p>
       <w:pPr>
         <w:pStyle w:val="ListBullet"/>
+        <w:widowControl/>
+        <w:spacing w:after="40" w:line="259" w:lineRule="auto"/>
         <w:rPr>
           <w:rFonts w:asciiTheme="majorHAnsi" w:hAnsiTheme="majorHAnsi" w:cstheme="majorHAnsi"/>
           <w:color w:val="000000" w:themeColor="text1"/>
@@ -797,7 +936,8 @@
     </w:p>
     <w:p>
       <w:pPr>
-        <w:spacing w:after="120"/>
+        <w:widowControl/>
+        <w:spacing w:after="100" w:line="259" w:lineRule="auto"/>
         <w:rPr>
           <w:rFonts w:asciiTheme="majorHAnsi" w:hAnsiTheme="majorHAnsi" w:cstheme="majorHAnsi"/>
           <w:color w:val="000000" w:themeColor="text1"/>
@@ -822,6 +962,8 @@
     <w:p>
       <w:pPr>
         <w:pStyle w:val="ListBullet"/>
+        <w:widowControl/>
+        <w:spacing w:after="40" w:line="259" w:lineRule="auto"/>
         <w:rPr>
           <w:rFonts w:asciiTheme="majorHAnsi" w:hAnsiTheme="majorHAnsi" w:cstheme="majorHAnsi"/>
           <w:color w:val="000000" w:themeColor="text1"/>
@@ -846,6 +988,8 @@
     <w:p>
       <w:pPr>
         <w:pStyle w:val="ListBullet"/>
+        <w:widowControl/>
+        <w:spacing w:after="40" w:line="259" w:lineRule="auto"/>
         <w:rPr>
           <w:rFonts w:asciiTheme="majorHAnsi" w:hAnsiTheme="majorHAnsi" w:cstheme="majorHAnsi"/>
           <w:color w:val="000000" w:themeColor="text1"/>
@@ -870,6 +1014,8 @@
     <w:p>
       <w:pPr>
         <w:pStyle w:val="ListBullet"/>
+        <w:widowControl/>
+        <w:spacing w:after="40" w:line="259" w:lineRule="auto"/>
         <w:rPr>
           <w:rFonts w:asciiTheme="majorHAnsi" w:hAnsiTheme="majorHAnsi" w:cstheme="majorHAnsi"/>
           <w:color w:val="000000" w:themeColor="text1"/>
@@ -881,7 +1027,6 @@
           <w:b/>
           <w:color w:val="000000" w:themeColor="text1"/>
         </w:rPr>
-        <w:lastRenderedPageBreak/>
         <w:t>conversation</w:t>
       </w:r>
       <w:r>
@@ -895,6 +1040,8 @@
     <w:p>
       <w:pPr>
         <w:pStyle w:val="ListBullet"/>
+        <w:widowControl/>
+        <w:spacing w:after="40" w:line="259" w:lineRule="auto"/>
         <w:rPr>
           <w:rFonts w:asciiTheme="majorHAnsi" w:hAnsiTheme="majorHAnsi" w:cstheme="majorHAnsi"/>
           <w:color w:val="000000" w:themeColor="text1"/>
@@ -906,46 +1053,39 @@
           <w:b/>
           <w:color w:val="000000" w:themeColor="text1"/>
         </w:rPr>
-        <w:t>last_customer_message</w:t>
+        <w:t>last_customer_message:</w:t>
       </w:r>
       <w:r>
         <w:rPr>
           <w:rFonts w:asciiTheme="majorHAnsi" w:hAnsiTheme="majorHAnsi" w:cstheme="majorHAnsi"/>
           <w:color w:val="000000" w:themeColor="text1"/>
         </w:rPr>
-        <w:t>: the last customer turn (or run of customer turns). Annotators read the whole conversation, and this last message mainly decides the tone label.</w:t>
+        <w:t xml:space="preserve"> the last customer turn or run of customer turns, retained for comparison with the full conversation. It illustrates what context is lost when only the last message is read. The annotation target is the whole conversation.</w:t>
       </w:r>
     </w:p>
     <w:p>
       <w:pPr>
-        <w:spacing w:after="120"/>
+        <w:widowControl/>
+        <w:spacing w:after="100" w:line="259" w:lineRule="auto"/>
         <w:rPr>
           <w:rFonts w:asciiTheme="majorHAnsi" w:hAnsiTheme="majorHAnsi" w:cstheme="majorHAnsi"/>
           <w:color w:val="000000" w:themeColor="text1"/>
         </w:rPr>
       </w:pPr>
       <w:hyperlink r:id="rId6" w:history="1">
-        <w:proofErr w:type="spellStart"/>
         <w:r>
           <w:rPr>
             <w:rStyle w:val="Hyperlink"/>
             <w:rFonts w:asciiTheme="majorHAnsi" w:hAnsiTheme="majorHAnsi" w:cstheme="majorHAnsi"/>
           </w:rPr>
-          <w:t>Conversation_Tone_Dataset</w:t>
-        </w:r>
-        <w:proofErr w:type="spellEnd"/>
-        <w:r>
-          <w:rPr>
-            <w:rStyle w:val="Hyperlink"/>
-            <w:rFonts w:asciiTheme="majorHAnsi" w:hAnsiTheme="majorHAnsi" w:cstheme="majorHAnsi"/>
-          </w:rPr>
-          <w:t xml:space="preserve"> - Google Drive</w:t>
+          <w:t>Conversation_Tone_Dataset - Google Drive</w:t>
         </w:r>
       </w:hyperlink>
     </w:p>
     <w:p>
       <w:pPr>
-        <w:spacing w:after="120"/>
+        <w:widowControl/>
+        <w:spacing w:after="100" w:line="259" w:lineRule="auto"/>
         <w:rPr>
           <w:rFonts w:asciiTheme="majorHAnsi" w:hAnsiTheme="majorHAnsi" w:cstheme="majorHAnsi"/>
           <w:color w:val="000000" w:themeColor="text1"/>
@@ -985,7 +1125,8 @@
     </w:p>
     <w:p>
       <w:pPr>
-        <w:spacing w:after="120"/>
+        <w:widowControl/>
+        <w:spacing w:after="100" w:line="259" w:lineRule="auto"/>
         <w:rPr>
           <w:rFonts w:asciiTheme="majorHAnsi" w:hAnsiTheme="majorHAnsi" w:cstheme="majorHAnsi"/>
           <w:color w:val="000000" w:themeColor="text1"/>
@@ -1001,7 +1142,8 @@
     </w:p>
     <w:p>
       <w:pPr>
-        <w:spacing w:after="120"/>
+        <w:widowControl/>
+        <w:spacing w:after="100" w:line="259" w:lineRule="auto"/>
         <w:rPr>
           <w:rFonts w:asciiTheme="majorHAnsi" w:hAnsiTheme="majorHAnsi" w:cstheme="majorHAnsi"/>
           <w:color w:val="000000" w:themeColor="text1"/>
@@ -1033,7 +1175,8 @@
     </w:p>
     <w:p>
       <w:pPr>
-        <w:spacing w:after="120"/>
+        <w:widowControl/>
+        <w:spacing w:after="100" w:line="259" w:lineRule="auto"/>
         <w:rPr>
           <w:rFonts w:asciiTheme="majorHAnsi" w:hAnsiTheme="majorHAnsi" w:cstheme="majorHAnsi"/>
           <w:color w:val="000000" w:themeColor="text1"/>
@@ -1044,12 +1187,14 @@
           <w:rFonts w:asciiTheme="majorHAnsi" w:hAnsiTheme="majorHAnsi" w:cstheme="majorHAnsi"/>
           <w:color w:val="000000" w:themeColor="text1"/>
         </w:rPr>
-        <w:t>We share one package per annotator (a zip file). Each package has a README with the setup steps, two batches of 100 conversations, and a copy of our annotation tool, Potato. Annotators install nothing except Python: they unzip the package, run one script, open http://localhost:8000 in the browser, log in with the username given in their README, and label one conversation at a time. The annotation guidelines (Customer Tone Annotation Guidelines) explain the labels with real examples. Answers are saved automatically, and annotators can stop and resume later. When finished, they zip the annotation_output folder and send it back to the contact below. Annotators can do the second batch if they want to label more.</w:t>
+        <w:t>Each annotator receives a zip package with setup instructions and two batches of 100 conversations. Batch 1 is required; Batch 2 is optional. Annotators need Python, then run the supplied script, open http://localhost:8000, and log in with their assigned username. Potato shows one conversation at a time and saves responses automatically. Annotators can stop and resume, then return their annotation_output folder when finished. The annotation guidelines define the labels with examples.</w:t>
       </w:r>
     </w:p>
     <w:p>
       <w:pPr>
-        <w:spacing w:after="120"/>
+        <w:keepNext/>
+        <w:widowControl/>
+        <w:spacing w:after="100" w:line="259" w:lineRule="auto"/>
         <w:rPr>
           <w:rFonts w:asciiTheme="majorHAnsi" w:hAnsiTheme="majorHAnsi" w:cstheme="majorHAnsi"/>
           <w:color w:val="000000" w:themeColor="text1"/>
@@ -1066,7 +1211,9 @@
     <w:p>
       <w:pPr>
         <w:pStyle w:val="ListBullet"/>
-        <w:spacing w:after="40"/>
+        <w:keepNext/>
+        <w:widowControl/>
+        <w:spacing w:after="40" w:line="259" w:lineRule="auto"/>
         <w:rPr>
           <w:rFonts w:asciiTheme="majorHAnsi" w:hAnsiTheme="majorHAnsi" w:cstheme="majorHAnsi"/>
           <w:color w:val="000000" w:themeColor="text1"/>
@@ -1077,13 +1224,16 @@
           <w:rFonts w:asciiTheme="majorHAnsi" w:hAnsiTheme="majorHAnsi" w:cstheme="majorHAnsi"/>
           <w:color w:val="000000" w:themeColor="text1"/>
         </w:rPr>
+        <w:lastRenderedPageBreak/>
         <w:t>Appreciative or positive</w:t>
       </w:r>
     </w:p>
     <w:p>
       <w:pPr>
         <w:pStyle w:val="ListBullet"/>
-        <w:spacing w:after="40"/>
+        <w:keepNext/>
+        <w:widowControl/>
+        <w:spacing w:after="40" w:line="259" w:lineRule="auto"/>
         <w:rPr>
           <w:rFonts w:asciiTheme="majorHAnsi" w:hAnsiTheme="majorHAnsi" w:cstheme="majorHAnsi"/>
           <w:color w:val="000000" w:themeColor="text1"/>
@@ -1100,7 +1250,9 @@
     <w:p>
       <w:pPr>
         <w:pStyle w:val="ListBullet"/>
-        <w:spacing w:after="40"/>
+        <w:keepNext/>
+        <w:widowControl/>
+        <w:spacing w:after="40" w:line="259" w:lineRule="auto"/>
         <w:rPr>
           <w:rFonts w:asciiTheme="majorHAnsi" w:hAnsiTheme="majorHAnsi" w:cstheme="majorHAnsi"/>
           <w:color w:val="000000" w:themeColor="text1"/>
@@ -1117,7 +1269,9 @@
     <w:p>
       <w:pPr>
         <w:pStyle w:val="ListBullet"/>
-        <w:spacing w:after="40"/>
+        <w:keepNext/>
+        <w:widowControl/>
+        <w:spacing w:after="40" w:line="259" w:lineRule="auto"/>
         <w:rPr>
           <w:rFonts w:asciiTheme="majorHAnsi" w:hAnsiTheme="majorHAnsi" w:cstheme="majorHAnsi"/>
           <w:color w:val="000000" w:themeColor="text1"/>
@@ -1134,7 +1288,8 @@
     <w:p>
       <w:pPr>
         <w:pStyle w:val="ListBullet"/>
-        <w:spacing w:after="40"/>
+        <w:widowControl/>
+        <w:spacing w:after="40" w:line="259" w:lineRule="auto"/>
         <w:rPr>
           <w:rFonts w:asciiTheme="majorHAnsi" w:hAnsiTheme="majorHAnsi" w:cstheme="majorHAnsi"/>
           <w:color w:val="000000" w:themeColor="text1"/>
@@ -1150,7 +1305,8 @@
     </w:p>
     <w:p>
       <w:pPr>
-        <w:spacing w:after="120"/>
+        <w:widowControl/>
+        <w:spacing w:after="100" w:line="259" w:lineRule="auto"/>
         <w:rPr>
           <w:rFonts w:asciiTheme="majorHAnsi" w:hAnsiTheme="majorHAnsi" w:cstheme="majorHAnsi"/>
           <w:color w:val="000000" w:themeColor="text1"/>
@@ -1161,12 +1317,13 @@
           <w:rFonts w:asciiTheme="majorHAnsi" w:hAnsiTheme="majorHAnsi" w:cstheme="majorHAnsi"/>
           <w:color w:val="000000" w:themeColor="text1"/>
         </w:rPr>
-        <w:t>Annotators read the whole conversation, judge only the customer's words (not the agent's tone or whether the problem was solved), and label the tone the customer ends on, because the last one or two customer messages decide the label. If more than one tone seems to fit, they use this order of precedence: Escalatory, Frustrated, Help-seeking, Appreciative, Neutral. Sarcastic thanks counts as a complaint, not as appreciation.</w:t>
+        <w:t>Annotators read the complete exchange and classify the customer's overall tone, using agent replies as context. They judge the customer's words, not the agent's tone or whether the problem was solved. The last message does not take priority. When multiple tones apply across the conversation, use this precedence: Escalatory, Frustrated, Help-seeking, Appreciative, Neutral. Sarcastic thanks counts as a complaint rather than appreciation.</w:t>
       </w:r>
     </w:p>
     <w:p>
       <w:pPr>
-        <w:spacing w:after="120"/>
+        <w:widowControl/>
+        <w:spacing w:after="100" w:line="259" w:lineRule="auto"/>
         <w:rPr>
           <w:rFonts w:asciiTheme="majorHAnsi" w:hAnsiTheme="majorHAnsi" w:cstheme="majorHAnsi"/>
           <w:color w:val="000000" w:themeColor="text1"/>
@@ -1182,7 +1339,8 @@
     </w:p>
     <w:p>
       <w:pPr>
-        <w:spacing w:after="120"/>
+        <w:widowControl/>
+        <w:spacing w:after="100" w:line="259" w:lineRule="auto"/>
         <w:rPr>
           <w:rFonts w:asciiTheme="majorHAnsi" w:hAnsiTheme="majorHAnsi" w:cstheme="majorHAnsi"/>
           <w:color w:val="000000" w:themeColor="text1"/>
@@ -1217,13 +1375,13 @@
           <w:rFonts w:cstheme="majorHAnsi"/>
           <w:color w:val="000000" w:themeColor="text1"/>
         </w:rPr>
-        <w:lastRenderedPageBreak/>
         <w:t>6. Annotation Design and Time per Item</w:t>
       </w:r>
     </w:p>
     <w:p>
       <w:pPr>
-        <w:spacing w:after="120"/>
+        <w:widowControl/>
+        <w:spacing w:after="100" w:line="259" w:lineRule="auto"/>
         <w:rPr>
           <w:rFonts w:asciiTheme="majorHAnsi" w:hAnsiTheme="majorHAnsi" w:cstheme="majorHAnsi"/>
           <w:color w:val="000000" w:themeColor="text1"/>
@@ -1242,12 +1400,13 @@
           <w:rFonts w:asciiTheme="majorHAnsi" w:hAnsiTheme="majorHAnsi" w:cstheme="majorHAnsi"/>
           <w:color w:val="000000" w:themeColor="text1"/>
         </w:rPr>
-        <w:t xml:space="preserve"> Reading one conversation (about 150 words) and choosing a tone takes about 30 to 45 seconds, so one annotator can label about 80 to 100 conversations in an hour. This is why each batch has 100 conversations. We will replace this estimate with the time we measure in our own annotation.</w:t>
+        <w:t xml:space="preserve"> Reading a conversation and choosing a tone is estimated to take 30–45 seconds. A batch of 100 would take about 50–75 minutes, before breaks. We will replace this estimate with measured annotation time.</w:t>
       </w:r>
     </w:p>
     <w:p>
       <w:pPr>
-        <w:spacing w:after="120"/>
+        <w:widowControl/>
+        <w:spacing w:after="100" w:line="259" w:lineRule="auto"/>
         <w:rPr>
           <w:rFonts w:asciiTheme="majorHAnsi" w:hAnsiTheme="majorHAnsi" w:cstheme="majorHAnsi"/>
           <w:color w:val="000000" w:themeColor="text1"/>
@@ -1266,12 +1425,14 @@
           <w:rFonts w:asciiTheme="majorHAnsi" w:hAnsiTheme="majorHAnsi" w:cstheme="majorHAnsi"/>
           <w:color w:val="000000" w:themeColor="text1"/>
         </w:rPr>
-        <w:t xml:space="preserve"> We have 6 annotators, and each gets two batches of 100 conversations, built from four groups. Batch 1 and batch 2 use different shared conversations.</w:t>
+        <w:t xml:space="preserve"> Six annotators each receive two batches of 100 conversations: Batch 1 is required and Batch 2 is optional. The planned allocation below is per annotator, per batch. The two rounds use different conversations.</w:t>
       </w:r>
     </w:p>
     <w:p>
       <w:pPr>
         <w:pStyle w:val="ListBullet"/>
+        <w:widowControl/>
+        <w:spacing w:after="40" w:line="259" w:lineRule="auto"/>
         <w:rPr>
           <w:rFonts w:asciiTheme="majorHAnsi" w:hAnsiTheme="majorHAnsi" w:cstheme="majorHAnsi"/>
           <w:color w:val="000000" w:themeColor="text1"/>
@@ -1283,19 +1444,21 @@
           <w:b/>
           <w:color w:val="000000" w:themeColor="text1"/>
         </w:rPr>
-        <w:t>All (20 per batch)</w:t>
+        <w:t>All (20 items per annotator):</w:t>
       </w:r>
       <w:r>
         <w:rPr>
           <w:rFonts w:asciiTheme="majorHAnsi" w:hAnsiTheme="majorHAnsi" w:cstheme="majorHAnsi"/>
           <w:color w:val="000000" w:themeColor="text1"/>
         </w:rPr>
-        <w:t>: labeled by every annotator, which gives 6 labels per item for agreement and a majority vote.</w:t>
+        <w:t xml:space="preserve"> 20 distinct conversations are assigned to all six annotators.</w:t>
       </w:r>
     </w:p>
     <w:p>
       <w:pPr>
         <w:pStyle w:val="ListBullet"/>
+        <w:widowControl/>
+        <w:spacing w:after="40" w:line="259" w:lineRule="auto"/>
         <w:rPr>
           <w:rFonts w:asciiTheme="majorHAnsi" w:hAnsiTheme="majorHAnsi" w:cstheme="majorHAnsi"/>
           <w:color w:val="000000" w:themeColor="text1"/>
@@ -1307,19 +1470,21 @@
           <w:b/>
           <w:color w:val="000000" w:themeColor="text1"/>
         </w:rPr>
-        <w:t>Pair (10 per batch)</w:t>
+        <w:t>Pair (10 items per annotator):</w:t>
       </w:r>
       <w:r>
         <w:rPr>
           <w:rFonts w:asciiTheme="majorHAnsi" w:hAnsiTheme="majorHAnsi" w:cstheme="majorHAnsi"/>
           <w:color w:val="000000" w:themeColor="text1"/>
         </w:rPr>
-        <w:t>: labeled by exactly 2 annotators.</w:t>
+        <w:t xml:space="preserve"> 30 distinct conversations are each assigned to two annotators (10 × 6 ÷ 2).</w:t>
       </w:r>
     </w:p>
     <w:p>
       <w:pPr>
         <w:pStyle w:val="ListBullet"/>
+        <w:widowControl/>
+        <w:spacing w:after="40" w:line="259" w:lineRule="auto"/>
         <w:rPr>
           <w:rFonts w:asciiTheme="majorHAnsi" w:hAnsiTheme="majorHAnsi" w:cstheme="majorHAnsi"/>
           <w:color w:val="000000" w:themeColor="text1"/>
@@ -1331,19 +1496,21 @@
           <w:b/>
           <w:color w:val="000000" w:themeColor="text1"/>
         </w:rPr>
-        <w:t>Triple (5 per batch)</w:t>
+        <w:t>Triple (5 items per annotator):</w:t>
       </w:r>
       <w:r>
         <w:rPr>
           <w:rFonts w:asciiTheme="majorHAnsi" w:hAnsiTheme="majorHAnsi" w:cstheme="majorHAnsi"/>
           <w:color w:val="000000" w:themeColor="text1"/>
         </w:rPr>
-        <w:t>: labeled by exactly 3 annotators.</w:t>
+        <w:t xml:space="preserve"> 10 distinct conversations are each assigned to three annotators (5 × 6 ÷ 3).</w:t>
       </w:r>
     </w:p>
     <w:p>
       <w:pPr>
         <w:pStyle w:val="ListBullet"/>
+        <w:widowControl/>
+        <w:spacing w:after="40" w:line="259" w:lineRule="auto"/>
         <w:rPr>
           <w:rFonts w:asciiTheme="majorHAnsi" w:hAnsiTheme="majorHAnsi" w:cstheme="majorHAnsi"/>
           <w:color w:val="000000" w:themeColor="text1"/>
@@ -1355,19 +1522,20 @@
           <w:b/>
           <w:color w:val="000000" w:themeColor="text1"/>
         </w:rPr>
-        <w:t>Unique (the other 65 per batch)</w:t>
+        <w:t>Unique (65 items per annotator):</w:t>
       </w:r>
       <w:r>
         <w:rPr>
           <w:rFonts w:asciiTheme="majorHAnsi" w:hAnsiTheme="majorHAnsi" w:cstheme="majorHAnsi"/>
           <w:color w:val="000000" w:themeColor="text1"/>
         </w:rPr>
-        <w:t>: labeled by one annotator, for coverage.</w:t>
+        <w:t xml:space="preserve"> 390 distinct conversations are each assigned to one annotator (65 × 6).</w:t>
       </w:r>
     </w:p>
     <w:p>
       <w:pPr>
-        <w:spacing w:after="120"/>
+        <w:widowControl/>
+        <w:spacing w:after="100" w:line="259" w:lineRule="auto"/>
         <w:rPr>
           <w:rFonts w:asciiTheme="majorHAnsi" w:hAnsiTheme="majorHAnsi" w:cstheme="majorHAnsi"/>
           <w:color w:val="000000" w:themeColor="text1"/>
@@ -1378,12 +1546,13 @@
           <w:rFonts w:asciiTheme="majorHAnsi" w:hAnsiTheme="majorHAnsi" w:cstheme="majorHAnsi"/>
           <w:color w:val="000000" w:themeColor="text1"/>
         </w:rPr>
-        <w:t>We chose this mix to balance redundancy and coverage. The all-annotator set gives a strong agreement estimate, the pair and triple sets let us compare different annotator combinations, and the unique conversations let us label many more different conversations (about 450 different conversations per batch round) than if everyone labeled the same items. The shared conversations are picked with a rule-based tone estimate that follows our guidelines, and only confident cases are used, with the same number of each tone label in every group so that all labels appear in the agreement set. There are no gold labels, so this estimate is only used to balance the sample. The unique conversations are a random draw from the rest of the dataset.</w:t>
+        <w:t>Each round contains 600 annotation assignments covering 450 distinct conversations: 390 + 20 + 30 + 10. Completing both rounds would cover 900 distinct conversations and 1,200 assignments. Optional participation determines the actual coverage and number of labels collected in Batch 2. Shared items support agreement analysis and majority voting where possible; unique items extend coverage. Shared examples are selected using confident rule-based estimates, balanced across the five estimated labels. These estimates are not gold labels, and agreement on clearer examples may not represent agreement on difficult cases. Unique items are sampled randomly from the remaining pool.</w:t>
       </w:r>
     </w:p>
     <w:p>
       <w:pPr>
         <w:pStyle w:val="Heading1"/>
+        <w:keepNext/>
         <w:rPr>
           <w:rFonts w:cstheme="majorHAnsi"/>
           <w:color w:val="000000" w:themeColor="text1"/>
@@ -1400,7 +1569,9 @@
     <w:p>
       <w:pPr>
         <w:pStyle w:val="ListBullet"/>
-        <w:spacing w:after="40"/>
+        <w:keepNext/>
+        <w:widowControl/>
+        <w:spacing w:after="40" w:line="259" w:lineRule="auto"/>
         <w:rPr>
           <w:rFonts w:asciiTheme="majorHAnsi" w:hAnsiTheme="majorHAnsi" w:cstheme="majorHAnsi"/>
           <w:color w:val="000000" w:themeColor="text1"/>
@@ -1417,7 +1588,9 @@
     <w:p>
       <w:pPr>
         <w:pStyle w:val="ListBullet"/>
-        <w:spacing w:after="40"/>
+        <w:keepNext/>
+        <w:widowControl/>
+        <w:spacing w:after="40" w:line="259" w:lineRule="auto"/>
         <w:rPr>
           <w:rFonts w:asciiTheme="majorHAnsi" w:hAnsiTheme="majorHAnsi" w:cstheme="majorHAnsi"/>
           <w:color w:val="000000" w:themeColor="text1"/>
@@ -1428,13 +1601,15 @@
           <w:rFonts w:asciiTheme="majorHAnsi" w:hAnsiTheme="majorHAnsi" w:cstheme="majorHAnsi"/>
           <w:color w:val="000000" w:themeColor="text1"/>
         </w:rPr>
-        <w:t>We organized the data into previous conversation and current customer message columns.</w:t>
+        <w:t>We retained whole conversations as the annotation target and a separate last_customer_message field so that models can later be compared with and without conversation context.</w:t>
       </w:r>
     </w:p>
     <w:p>
       <w:pPr>
         <w:pStyle w:val="ListBullet"/>
-        <w:spacing w:after="40"/>
+        <w:keepNext/>
+        <w:widowControl/>
+        <w:spacing w:after="40" w:line="259" w:lineRule="auto"/>
         <w:rPr>
           <w:rFonts w:asciiTheme="majorHAnsi" w:hAnsiTheme="majorHAnsi" w:cstheme="majorHAnsi"/>
           <w:color w:val="000000" w:themeColor="text1"/>
@@ -1445,13 +1620,15 @@
           <w:rFonts w:asciiTheme="majorHAnsi" w:hAnsiTheme="majorHAnsi" w:cstheme="majorHAnsi"/>
           <w:color w:val="000000" w:themeColor="text1"/>
         </w:rPr>
-        <w:t>We removed user information and filtered out unreadable messages.</w:t>
+        <w:t>We removed user handles and agent sign-offs, kept English, translated Spanish to English, and dropped other languages.</w:t>
       </w:r>
     </w:p>
     <w:p>
       <w:pPr>
         <w:pStyle w:val="ListBullet"/>
-        <w:spacing w:after="40"/>
+        <w:keepNext/>
+        <w:widowControl/>
+        <w:spacing w:after="40" w:line="259" w:lineRule="auto"/>
         <w:rPr>
           <w:rFonts w:asciiTheme="majorHAnsi" w:hAnsiTheme="majorHAnsi" w:cstheme="majorHAnsi"/>
           <w:color w:val="000000" w:themeColor="text1"/>
@@ -1462,26 +1639,71 @@
           <w:rFonts w:asciiTheme="majorHAnsi" w:hAnsiTheme="majorHAnsi" w:cstheme="majorHAnsi"/>
           <w:color w:val="000000" w:themeColor="text1"/>
         </w:rPr>
-        <w:t xml:space="preserve">We added an optional secondary label based on the </w:t>
-      </w:r>
-      <w:r>
-        <w:rPr>
-          <w:rFonts w:asciiTheme="majorHAnsi" w:hAnsiTheme="majorHAnsi" w:cstheme="majorHAnsi"/>
-          <w:color w:val="000000" w:themeColor="text1"/>
-        </w:rPr>
-        <w:t>project proposal feedback</w:t>
-      </w:r>
-      <w:r>
-        <w:rPr>
-          <w:rFonts w:asciiTheme="majorHAnsi" w:hAnsiTheme="majorHAnsi" w:cstheme="majorHAnsi"/>
-          <w:color w:val="000000" w:themeColor="text1"/>
-        </w:rPr>
-        <w:t>.</w:t>
+        <w:t>We added an optional secondary label based on the project proposal feedback.</w:t>
       </w:r>
     </w:p>
     <w:p>
       <w:pPr>
-        <w:spacing w:after="120"/>
+        <w:pStyle w:val="ListBullet"/>
+        <w:keepNext/>
+        <w:widowControl/>
+        <w:spacing w:after="40" w:line="259" w:lineRule="auto"/>
+        <w:rPr>
+          <w:rFonts w:asciiTheme="majorHAnsi" w:hAnsiTheme="majorHAnsi" w:cstheme="majorHAnsi"/>
+          <w:color w:val="000000" w:themeColor="text1"/>
+        </w:rPr>
+      </w:pPr>
+      <w:r>
+        <w:rPr>
+          <w:rFonts w:asciiTheme="majorHAnsi" w:hAnsiTheme="majorHAnsi" w:cstheme="majorHAnsi"/>
+          <w:color w:val="000000" w:themeColor="text1"/>
+        </w:rPr>
+        <w:t>We used one brand, AmazonHelp, so every annotator sees the same kind of problems.</w:t>
+      </w:r>
+    </w:p>
+    <w:p>
+      <w:pPr>
+        <w:pStyle w:val="ListBullet"/>
+        <w:keepNext/>
+        <w:widowControl/>
+        <w:spacing w:after="40" w:line="259" w:lineRule="auto"/>
+        <w:rPr>
+          <w:rFonts w:asciiTheme="majorHAnsi" w:hAnsiTheme="majorHAnsi" w:cstheme="majorHAnsi"/>
+          <w:color w:val="000000" w:themeColor="text1"/>
+        </w:rPr>
+      </w:pPr>
+      <w:r>
+        <w:rPr>
+          <w:rFonts w:asciiTheme="majorHAnsi" w:hAnsiTheme="majorHAnsi" w:cstheme="majorHAnsi"/>
+          <w:color w:val="000000" w:themeColor="text1"/>
+        </w:rPr>
+        <w:lastRenderedPageBreak/>
+        <w:t>We kept only multi-turn conversations (at least 2 customer and 2 agent turns), so tone can be judged over a real exchange.</w:t>
+      </w:r>
+    </w:p>
+    <w:p>
+      <w:pPr>
+        <w:pStyle w:val="ListBullet"/>
+        <w:keepNext/>
+        <w:widowControl/>
+        <w:spacing w:after="40" w:line="259" w:lineRule="auto"/>
+        <w:rPr>
+          <w:rFonts w:asciiTheme="majorHAnsi" w:hAnsiTheme="majorHAnsi" w:cstheme="majorHAnsi"/>
+          <w:color w:val="000000" w:themeColor="text1"/>
+        </w:rPr>
+      </w:pPr>
+      <w:r>
+        <w:rPr>
+          <w:rFonts w:asciiTheme="majorHAnsi" w:hAnsiTheme="majorHAnsi" w:cstheme="majorHAnsi"/>
+          <w:color w:val="000000" w:themeColor="text1"/>
+        </w:rPr>
+        <w:t>We added an order of precedence for mixed tones: Escalatory, Frustrated, Help-seeking, Appreciative, Neutral.</w:t>
+      </w:r>
+    </w:p>
+    <w:p>
+      <w:pPr>
+        <w:widowControl/>
+        <w:spacing w:after="100" w:line="259" w:lineRule="auto"/>
         <w:rPr>
           <w:rFonts w:asciiTheme="majorHAnsi" w:hAnsiTheme="majorHAnsi" w:cstheme="majorHAnsi"/>
         </w:rPr>
@@ -1489,7 +1711,7 @@
     </w:p>
     <w:sectPr>
       <w:pgSz w:w="12240" w:h="15840"/>
-      <w:pgMar w:top="1440" w:right="1080" w:bottom="1440" w:left="1080" w:header="720" w:footer="720" w:gutter="0"/>
+      <w:pgMar w:top="1152" w:right="1080" w:bottom="1152" w:left="1080" w:header="720" w:footer="720" w:gutter="0"/>
       <w:cols w:space="720"/>
       <w:docGrid w:linePitch="360"/>
     </w:sectPr>

</xml_diff>

<commit_message>
Update Customer Tone Annotation Guidelines.md: Clarified instructions for labeling customer tones by specifying that the focus is on the customer's last message, adjusted the order of precedence for tone classification, and refined examples to enhance understanding of tone determination.
</commit_message>
<xml_diff>
--- a/docs/Phase 1.docx
+++ b/docs/Phase 1.docx
@@ -66,7 +66,7 @@
           <w:rFonts w:asciiTheme="majorHAnsi" w:hAnsiTheme="majorHAnsi" w:cstheme="majorHAnsi"/>
           <w:color w:val="000000" w:themeColor="text1"/>
         </w:rPr>
-        <w:t>Our task is to classify the customer's overall tone across a complete customer-support conversation into five categories: appreciative or positive, neutral or informational, help-seeking or asking a question, frustrated or complaining, and escalatory or requesting immediate resolution. Customer messages provide the evidence; agent replies provide context.</w:t>
+        <w:t xml:space="preserve">Our task is to classify the tone of the customer’s last message in a customer-support conversation into five categories: appreciative or positive, neutral or informational, help-seeking or asking a question, frustrated or complaining, and escalatory or requesting immediate resolution. The earlier conversation is used as context when the last message alone is unclear.</w:t>
       </w:r>
     </w:p>
     <w:p>
@@ -209,7 +209,7 @@
           <w:rFonts w:asciiTheme="majorHAnsi" w:hAnsiTheme="majorHAnsi" w:cstheme="majorHAnsi"/>
           <w:color w:val="000000" w:themeColor="text1"/>
         </w:rPr>
-        <w:t>Last customer message (shown separately for comparison with the full conversation):</w:t>
+        <w:t xml:space="preserve">Last customer message (this decides the label):</w:t>
       </w:r>
     </w:p>
     <w:p>
@@ -278,7 +278,7 @@
           <w:rFonts w:asciiTheme="majorHAnsi" w:hAnsiTheme="majorHAnsi" w:cstheme="majorHAnsi"/>
           <w:color w:val="000000" w:themeColor="text1"/>
         </w:rPr>
-        <w:t>Why: across the exchange, the customer complains about generic replies, asks for a human, requests a manager, and mentions a lawsuit. These demands and threats support the Escalatory label. The final message shows escalation, while the history explains how it developed.</w:t>
+        <w:t xml:space="preserve">Why: the last message asks for a manager and mentions a lawsuit, a demand plus a threat. The earlier messages show how it built up but are not needed to decide.</w:t>
       </w:r>
     </w:p>
     <w:p>
@@ -460,14 +460,14 @@
           <w:b/>
           <w:color w:val="000000" w:themeColor="text1"/>
         </w:rPr>
-        <w:t>Studying conversation context.</w:t>
+        <w:t xml:space="preserve">Studying conversation context.</w:t>
       </w:r>
       <w:r>
         <w:rPr>
           <w:rFonts w:asciiTheme="majorHAnsi" w:hAnsiTheme="majorHAnsi" w:cstheme="majorHAnsi"/>
           <w:color w:val="000000" w:themeColor="text1"/>
         </w:rPr>
-        <w:t xml:space="preserve"> A short message such as “Thanks a lot” may express appreciation or sarcasm. Reading the exchange helps interpret it. Conversation-level labels allow us to study whether models benefit from that context.</w:t>
+        <w:t xml:space="preserve"> A short message such as “Thanks a lot” may be appreciation or sarcasm; earlier turns help when the last message is unclear. Keeping both the last message and the full conversation lets us study whether models benefit from that context.</w:t>
       </w:r>
     </w:p>
     <w:p>
@@ -1053,14 +1053,14 @@
           <w:b/>
           <w:color w:val="000000" w:themeColor="text1"/>
         </w:rPr>
-        <w:t>last_customer_message:</w:t>
+        <w:t xml:space="preserve">last_customer_message:</w:t>
       </w:r>
       <w:r>
         <w:rPr>
           <w:rFonts w:asciiTheme="majorHAnsi" w:hAnsiTheme="majorHAnsi" w:cstheme="majorHAnsi"/>
           <w:color w:val="000000" w:themeColor="text1"/>
         </w:rPr>
-        <w:t xml:space="preserve"> the last customer turn or run of customer turns, retained for comparison with the full conversation. It illustrates what context is lost when only the last message is read. The annotation target is the whole conversation.</w:t>
+        <w:t xml:space="preserve"> the last customer turn or run of customer turns. This is what annotators label; the full conversation is context for unclear cases.</w:t>
       </w:r>
     </w:p>
     <w:p>
@@ -1317,7 +1317,7 @@
           <w:rFonts w:asciiTheme="majorHAnsi" w:hAnsiTheme="majorHAnsi" w:cstheme="majorHAnsi"/>
           <w:color w:val="000000" w:themeColor="text1"/>
         </w:rPr>
-        <w:t>Annotators read the complete exchange and classify the customer's overall tone, using agent replies as context. They judge the customer's words, not the agent's tone or whether the problem was solved. The last message does not take priority. When multiple tones apply across the conversation, use this precedence: Escalatory, Frustrated, Help-seeking, Appreciative, Neutral. Sarcastic thanks counts as a complaint rather than appreciation.</w:t>
+        <w:t xml:space="preserve">Annotators label the tone of the customer’s last message. They read the earlier conversation for context and use it to decide only when the last message is unclear (a short reply, a bare “thanks”, possible sarcasm). They judge the customer’s words, not the agent’s tone or whether the problem was solved. If the last message shows more than one tone, use this precedence: Escalatory, Frustrated, Help-seeking, Appreciative, Neutral. Sarcastic thanks counts as a complaint rather than appreciation.</w:t>
       </w:r>
     </w:p>
     <w:p>
@@ -1444,14 +1444,14 @@
           <w:b/>
           <w:color w:val="000000" w:themeColor="text1"/>
         </w:rPr>
-        <w:t>All (20 items per annotator):</w:t>
+        <w:t xml:space="preserve">All (30 items per annotator):</w:t>
       </w:r>
       <w:r>
         <w:rPr>
           <w:rFonts w:asciiTheme="majorHAnsi" w:hAnsiTheme="majorHAnsi" w:cstheme="majorHAnsi"/>
           <w:color w:val="000000" w:themeColor="text1"/>
         </w:rPr>
-        <w:t xml:space="preserve"> 20 distinct conversations are assigned to all six annotators.</w:t>
+        <w:t xml:space="preserve"> 30 distinct conversations are assigned to all six annotators, so each gets six labels.</w:t>
       </w:r>
     </w:p>
     <w:p>
@@ -1470,70 +1470,18 @@
           <w:b/>
           <w:color w:val="000000" w:themeColor="text1"/>
         </w:rPr>
-        <w:t>Pair (10 items per annotator):</w:t>
+        <w:t xml:space="preserve">Unique (70 items per annotator):</w:t>
       </w:r>
       <w:r>
         <w:rPr>
           <w:rFonts w:asciiTheme="majorHAnsi" w:hAnsiTheme="majorHAnsi" w:cstheme="majorHAnsi"/>
           <w:color w:val="000000" w:themeColor="text1"/>
         </w:rPr>
-        <w:t xml:space="preserve"> 30 distinct conversations are each assigned to two annotators (10 × 6 ÷ 2).</w:t>
+        <w:t xml:space="preserve"> 420 distinct conversations are each assigned to one annotator (70 × 6).</w:t>
       </w:r>
     </w:p>
     <w:p>
       <w:pPr>
-        <w:pStyle w:val="ListBullet"/>
-        <w:widowControl/>
-        <w:spacing w:after="40" w:line="259" w:lineRule="auto"/>
-        <w:rPr>
-          <w:rFonts w:asciiTheme="majorHAnsi" w:hAnsiTheme="majorHAnsi" w:cstheme="majorHAnsi"/>
-          <w:color w:val="000000" w:themeColor="text1"/>
-        </w:rPr>
-      </w:pPr>
-      <w:r>
-        <w:rPr>
-          <w:rFonts w:asciiTheme="majorHAnsi" w:hAnsiTheme="majorHAnsi" w:cstheme="majorHAnsi"/>
-          <w:b/>
-          <w:color w:val="000000" w:themeColor="text1"/>
-        </w:rPr>
-        <w:t>Triple (5 items per annotator):</w:t>
-      </w:r>
-      <w:r>
-        <w:rPr>
-          <w:rFonts w:asciiTheme="majorHAnsi" w:hAnsiTheme="majorHAnsi" w:cstheme="majorHAnsi"/>
-          <w:color w:val="000000" w:themeColor="text1"/>
-        </w:rPr>
-        <w:t xml:space="preserve"> 10 distinct conversations are each assigned to three annotators (5 × 6 ÷ 3).</w:t>
-      </w:r>
-    </w:p>
-    <w:p>
-      <w:pPr>
-        <w:pStyle w:val="ListBullet"/>
-        <w:widowControl/>
-        <w:spacing w:after="40" w:line="259" w:lineRule="auto"/>
-        <w:rPr>
-          <w:rFonts w:asciiTheme="majorHAnsi" w:hAnsiTheme="majorHAnsi" w:cstheme="majorHAnsi"/>
-          <w:color w:val="000000" w:themeColor="text1"/>
-        </w:rPr>
-      </w:pPr>
-      <w:r>
-        <w:rPr>
-          <w:rFonts w:asciiTheme="majorHAnsi" w:hAnsiTheme="majorHAnsi" w:cstheme="majorHAnsi"/>
-          <w:b/>
-          <w:color w:val="000000" w:themeColor="text1"/>
-        </w:rPr>
-        <w:t>Unique (65 items per annotator):</w:t>
-      </w:r>
-      <w:r>
-        <w:rPr>
-          <w:rFonts w:asciiTheme="majorHAnsi" w:hAnsiTheme="majorHAnsi" w:cstheme="majorHAnsi"/>
-          <w:color w:val="000000" w:themeColor="text1"/>
-        </w:rPr>
-        <w:t xml:space="preserve"> 390 distinct conversations are each assigned to one annotator (65 × 6).</w:t>
-      </w:r>
-    </w:p>
-    <w:p>
-      <w:pPr>
         <w:widowControl/>
         <w:spacing w:after="100" w:line="259" w:lineRule="auto"/>
         <w:rPr>
@@ -1546,7 +1494,7 @@
           <w:rFonts w:asciiTheme="majorHAnsi" w:hAnsiTheme="majorHAnsi" w:cstheme="majorHAnsi"/>
           <w:color w:val="000000" w:themeColor="text1"/>
         </w:rPr>
-        <w:t>Each round contains 600 annotation assignments covering 450 distinct conversations: 390 + 20 + 30 + 10. Completing both rounds would cover 900 distinct conversations and 1,200 assignments. Optional participation determines the actual coverage and number of labels collected in Batch 2. Shared items support agreement analysis and majority voting where possible; unique items extend coverage. Shared examples are selected using confident rule-based estimates, balanced across the five estimated labels. These estimates are not gold labels, and agreement on clearer examples may not represent agreement on difficult cases. Unique items are sampled randomly from the remaining pool.</w:t>
+        <w:t xml:space="preserve">Each round contains 600 annotation assignments covering 450 distinct conversations: 30 + 420. Completing both rounds would cover 900 distinct conversations and 1,200 assignments. Optional participation determines the actual coverage and number of labels collected in Batch 2. We chose one shared set of 30 instead of smaller pair and triple groups. Coverage stays the same (450 distinct conversations per round), every shared item gets six labels for agreement and a majority vote, each of the five labels has about six shared items, and shared items keep several labels if an annotator drops out. Unique items extend coverage. Shared examples are selected using confident rule-based estimates, balanced across the five estimated labels. These estimates are not gold labels, and agreement on clearer examples may not represent agreement on difficult cases. Unique items are sampled randomly from the remaining pool.</w:t>
       </w:r>
     </w:p>
     <w:p>
@@ -1601,7 +1549,7 @@
           <w:rFonts w:asciiTheme="majorHAnsi" w:hAnsiTheme="majorHAnsi" w:cstheme="majorHAnsi"/>
           <w:color w:val="000000" w:themeColor="text1"/>
         </w:rPr>
-        <w:t>We retained whole conversations as the annotation target and a separate last_customer_message field so that models can later be compared with and without conversation context.</w:t>
+        <w:t xml:space="preserve">The label is the tone of the customer’s last message, with the whole conversation as context when needed. We keep both fields, so models can later be compared with and without context.</w:t>
       </w:r>
     </w:p>
     <w:p>

</xml_diff>